<commit_message>
README: centered title, demo GIF and dashboard screenshot, architecture diagram; no NaN scores in tooltips
</commit_message>
<xml_diff>
--- a/docs/Demo_Script.docx
+++ b/docs/Demo_Script.docx
@@ -1017,6 +1017,12 @@
           <w:p>
             <w:r>
               <w:rPr>
+                <w:rFonts w:ascii="Arial" w:cs="Arial" w:eastAsia="Arial" w:hAnsi="Arial"/>
+              </w:rPr>
+              <w:t xml:space="preserve">Click </w:t>
+            </w:r>
+            <w:r>
+              <w:rPr>
                 <w:b/>
                 <w:bCs/>
                 <w:rFonts w:ascii="Arial" w:cs="Arial" w:eastAsia="Arial" w:hAnsi="Arial"/>
@@ -1027,7 +1033,7 @@
               <w:rPr>
                 <w:rFonts w:ascii="Arial" w:cs="Arial" w:eastAsia="Arial" w:hAnsi="Arial"/>
               </w:rPr>
-              <w:t xml:space="preserve">: click quickly through </w:t>
+              <w:t xml:space="preserve"> in the header (clipboard icon), then its four tabs at the top: </w:t>
             </w:r>
             <w:r>
               <w:rPr>

</xml_diff>